<commit_message>
refactor: remove Catatan & Tanda Bintang from Formulir Pendaftaran Ujian Skripsi
</commit_message>
<xml_diff>
--- a/template_ujian.docx
+++ b/template_ujian.docx
@@ -425,47 +425,6 @@
           <w:lang w:val="sv-SE"/>
         </w:rPr>
         <w:t xml:space="preserve">NIM : </w:t>
-      </w:r>
-    </w:p>
-    <w:p>
-      <w:pPr>
-        <w:spacing w:after="0"/>
-        <w:rPr>
-          <w:rFonts w:ascii="Times New Roman" w:hAnsi="Times New Roman" w:cs="Times New Roman"/>
-          <w:lang w:val="sv-SE"/>
-        </w:rPr>
-      </w:pPr>
-    </w:p>
-    <w:p>
-      <w:pPr>
-        <w:spacing w:after="0"/>
-        <w:rPr>
-          <w:rFonts w:ascii="Times New Roman" w:hAnsi="Times New Roman" w:cs="Times New Roman"/>
-          <w:lang w:val="sv-SE"/>
-        </w:rPr>
-      </w:pPr>
-      <w:r>
-        <w:rPr>
-          <w:rFonts w:ascii="Times New Roman" w:hAnsi="Times New Roman" w:cs="Times New Roman"/>
-          <w:lang w:val="sv-SE"/>
-        </w:rPr>
-        <w:t xml:space="preserve">Catatan : </w:t>
-      </w:r>
-    </w:p>
-    <w:p>
-      <w:pPr>
-        <w:spacing w:after="0"/>
-        <w:rPr>
-          <w:rFonts w:ascii="Times New Roman" w:hAnsi="Times New Roman" w:cs="Times New Roman"/>
-          <w:lang w:val="sv-SE"/>
-        </w:rPr>
-      </w:pPr>
-      <w:r>
-        <w:rPr>
-          <w:rFonts w:ascii="Times New Roman" w:hAnsi="Times New Roman" w:cs="Times New Roman"/>
-          <w:lang w:val="sv-SE"/>
-        </w:rPr>
-        <w:t>Tanda Bintang (*): Menyesuaikan Semester dan Tahun Akademik yang berlaku.</w:t>
       </w:r>
     </w:p>
     <w:sectPr>

</xml_diff>